<commit_message>
Make technical report self-contained
</commit_message>
<xml_diff>
--- a/report/inconel617_revised_technical_report.docx
+++ b/report/inconel617_revised_technical_report.docx
@@ -10,7 +10,7 @@
         <w:rPr>
           <w:b w:val="0"/>
         </w:rPr>
-        <w:t>Numerical mesoscale modelling of Inconel 617 — revised technical report</w:t>
+        <w:t xml:space="preserve">Numerical mesoscale modelling of Inconel 617</w:t>
       </w:r>
     </w:p>
     <w:p>
@@ -37,7 +37,7 @@
         <w:rPr>
           <w:b w:val="0"/>
         </w:rPr>
-        <w:t>Original project credit: Sandhra M Lal, Aiswarya R, Thanvir Diouf and Mamidi Mahima Praharsha, Department of Mechanical Engineering, National Institute of Technology Calicut, May 2024.</w:t>
+        <w:t xml:space="preserve">Project authors: Sandhra M Lal, Aiswarya R, Thanvir Diouf and Mamidi Mahima Praharsha, Department of Mechanical Engineering, National Institute of Technology Calicut.</w:t>
       </w:r>
     </w:p>
     <w:p>
@@ -45,7 +45,7 @@
         <w:rPr>
           <w:b w:val="0"/>
         </w:rPr>
-        <w:t>This revised technical copy develops the original cellular automaton project into a reproducible computational study. The archived student report and Java prototypes remain the record of the original work. This copy records the corrected simulator, its preserved constitutive candidates, new numerical comparisons and the evidence needed before empirical prediction claims can be made. It does not replace the original institutional certification.</w:t>
+        <w:t xml:space="preserve">This report presents a reproducible cellular automaton study of hot deformation in Inconel 617. It describes the implemented material candidates, governing equations, numerical method and process comparisons. The results support evaluation of a working computational model; measured stress–strain and microstructure data are needed before quantitative material predictions can be validated.</w:t>
       </w:r>
     </w:p>
     <w:p>
@@ -61,7 +61,7 @@
         <w:rPr>
           <w:b w:val="0"/>
         </w:rPr>
-        <w:t>A two-dimensional cellular automaton represents grain ownership, grain-scale dislocation density, nucleation of discontinuous dynamic recrystallization and grain-boundary migration during uniform hot deformation of Inconel 617. The corrected implementation uses SI units, a fully filled Voronoi initial lattice, physical nucleus and nucleation-band dimensions, bounded Poisson capture probabilities and simultaneous state updates. Dislocation density is advanced with a positive split integration scheme. Separate constitutive candidates retain the provenance of CAC2, MAIN9, FINAL_CA and an early temperature-fit variant.</w:t>
+        <w:t xml:space="preserve">A two-dimensional cellular automaton represents grain ownership, grain-scale dislocation density, nucleation of discontinuous dynamic recrystallization and grain-boundary migration during uniform hot deformation of Inconel 617. The implementation uses SI units, a fully filled Voronoi initial lattice, physical nucleus and nucleation-band dimensions, bounded Poisson capture probabilities and simultaneous state updates. Dislocation density is advanced with a positive split integration scheme. Four distinct constitutive candidates are available: CAC2, MAIN9, FINAL_CA and VARIANT.</w:t>
       </w:r>
     </w:p>
     <w:p>
@@ -85,7 +85,7 @@
         <w:rPr>
           <w:b w:val="0"/>
         </w:rPr>
-        <w:t>Sections 1 to 3 define the material, source versions and governing equations. Sections 4 to 6 give the FINAL_CA calibration and numerical method. Sections 7 to 9 present verification and new simulated results. Sections 10 and 11 state the validation requirements and conclusions. References and the reproducibility record follow.</w:t>
+        <w:t xml:space="preserve">Sections 1 to 3 define the material, constitutive candidates and governing equations. Sections 4 to 6 describe FINAL_CA and the numerical method. Sections 7 to 9 present verification, simulated results and sensitivity. Sections 10 and 11 set out validation requirements and conclusions. References and the reproducibility record follow.</w:t>
       </w:r>
     </w:p>
     <w:p>
@@ -106,7 +106,7 @@
         <w:rPr>
           <w:b w:val="0"/>
         </w:rPr>
-        <w:t>Inconel alloy 617 is a solid-solution-strengthened nickel-chromium-cobalt-molybdenum alloy. Table 1 gives the manufacturer’s limiting composition, rather than the Ni-Cr-Fe-Mo composition printed in the original project report. Actual specimen chemistry must still be taken from its heat certificate [1].</w:t>
+        <w:t xml:space="preserve">Inconel alloy 617 is a solid-solution-strengthened nickel-chromium-cobalt-molybdenum alloy. Table 1 gives the manufacturer’s limiting composition. Actual specimen chemistry must be taken from its heat certificate [1].</w:t>
       </w:r>
     </w:p>
     <w:p>
@@ -704,7 +704,7 @@
         <w:rPr>
           <w:b w:val="0"/>
         </w:rPr>
-        <w:t>The intended application range is 1173.15 to 1473.15 K (900 to 1200 °C), with constant strain rates of 0.001 to 0.1 s⁻¹. These conditions are described as hot deformation. The present production matrix samples six conditions within this range rather than mapping the full domain. Babu et al. studied alloy 617 at 1173 to 1473 K and 0.001 to 10 s⁻¹ and identified an optimum domain of 1323 to 1423 K and 0.001 to 0.1 s⁻¹ [2]. Their reported average activation energy is 481 kJ mol⁻¹, distinct from the inherited/refitted 493.039 kJ mol⁻¹ used by FINAL_CA. This literature provides a relevant experimental basis; its processing map does not independently validate the present simulator.</w:t>
+        <w:t xml:space="preserve">The intended application range is 1173.15 to 1473.15 K (900 to 1200 °C), with constant strain rates of 0.001 to 0.1 s⁻¹. The production matrix samples six conditions within this range rather than mapping the full domain. Babu et al. studied alloy 617 at 1173 to 1473 K and 0.001 to 10 s⁻¹ and identified an optimum domain of 1323 to 1423 K and 0.001 to 0.1 s⁻¹ [2]. Their average activation energy is 481 kJ mol⁻¹, distinct from the 493.039 kJ mol⁻¹ implemented by FINAL_CA. This literature provides experimental context; its processing map does not independently validate the simulator.</w:t>
       </w:r>
     </w:p>
     <w:p>
@@ -757,7 +757,7 @@
         <w:pStyle w:val="Heading1"/>
       </w:pPr>
       <w:r>
-        <w:t>2 Source versions and evidence</w:t>
+        <w:t xml:space="preserve">2 Constitutive candidates and implementation</w:t>
       </w:r>
     </w:p>
     <w:p>
@@ -765,7 +765,7 @@
         <w:rPr>
           <w:b w:val="0"/>
         </w:rPr>
-        <w:t>The constitutive candidates are kept separate because the archived Java files do not define one consistent final calibration. Their names identify executable parameter provenance, not different alloys or independently validated material databases.</w:t>
+        <w:t xml:space="preserve">The four candidate parameter sets share the same numerical engine. Their names select different constitutive equations, not different alloys or independently validated material databases. This separation supports matched comparisons of calibration choices while keeping geometry and numerical controls fixed.</w:t>
       </w:r>
     </w:p>
     <w:p>
@@ -857,7 +857,7 @@
                 <w:b/>
                 <w:sz w:val="18"/>
               </w:rPr>
-              <w:t>Archived source</w:t>
+              <w:t xml:space="preserve">Model option</w:t>
             </w:r>
           </w:p>
         </w:tc>
@@ -959,7 +959,7 @@
                 <w:b w:val="0"/>
                 <w:sz w:val="18"/>
               </w:rPr>
-              <w:t>CAC_final (2).java</w:t>
+              <w:t xml:space="preserve">--model cac2</w:t>
             </w:r>
           </w:p>
         </w:tc>
@@ -1062,7 +1062,7 @@
                 <w:b w:val="0"/>
                 <w:sz w:val="18"/>
               </w:rPr>
-              <w:t>Main (9).java</w:t>
+              <w:t xml:space="preserve">--model main9</w:t>
             </w:r>
           </w:p>
         </w:tc>
@@ -1164,7 +1164,7 @@
                 <w:b w:val="0"/>
                 <w:sz w:val="18"/>
               </w:rPr>
-              <w:t>files654/final-CA-15-4/untitled/src/Main.java</w:t>
+              <w:t xml:space="preserve">--model final_ca</w:t>
             </w:r>
           </w:p>
         </w:tc>
@@ -1196,7 +1196,7 @@
                 <w:b w:val="0"/>
                 <w:sz w:val="18"/>
               </w:rPr>
-              <w:t>Critical factor 0.95; temperature-only nucleation exponent; closest active laws to the final PDF.</w:t>
+              <w:t xml:space="preserve">Critical factor 0.95; temperature-only nucleation exponent; used for the six-condition process comparison.</w:t>
             </w:r>
           </w:p>
         </w:tc>
@@ -1267,7 +1267,7 @@
                 <w:b w:val="0"/>
                 <w:sz w:val="18"/>
               </w:rPr>
-              <w:t>Main_variant.java</w:t>
+              <w:t xml:space="preserve">--model variant</w:t>
             </w:r>
           </w:p>
         </w:tc>
@@ -1300,7 +1300,7 @@
                 <w:b w:val="0"/>
                 <w:sz w:val="18"/>
               </w:rPr>
-              <w:t>Early temperature-linear peak-stress and recovery fits; fixed nucleation rate; ambiguous 450 J mol⁻¹ mobility exponent.</w:t>
+              <w:t xml:space="preserve">Temperature-linear peak-stress and recovery fits; fixed nucleation rate; 450 J mol⁻¹ mobility exponent requiring calibration.</w:t>
             </w:r>
           </w:p>
         </w:tc>
@@ -1318,7 +1318,7 @@
         <w:rPr>
           <w:b w:val="0"/>
         </w:rPr>
-        <w:t>The top-level files654/Main.java is another archived variant. It uses a critical factor of 0.84, a different temperature-dependent nucleation exponent, and mobility and nucleation coefficients normalised to 1323 K. It is not the nested FINAL_CA calibration. The corrected engine removes the legacy doubling of the requested strain rate and per-grain random coefficient modifiers. New results therefore cannot be described as a byte-for-byte reproduction of the archived program.</w:t>
+        <w:t xml:space="preserve">All four parameter sets are implemented in src/inconel617/MaterialModels.java. Grain ownership, dislocation-density advancement, nucleation and migration are handled by src/inconel617/DrxSimulation.java. The applied strain rate equals the entered value, with no hidden multiplier. Temperature, length and output units are explicit.</w:t>
       </w:r>
     </w:p>
     <w:p>
@@ -1326,7 +1326,7 @@
         <w:rPr>
           <w:b w:val="0"/>
         </w:rPr>
-        <w:t>The saved nested Main.class also differs from its source: its nucleation-exponent transition uses 1383 K, power 107, coefficient 0.75 and offset 0.18. The active source uses Eq. 13 below. The legacy files named flowstress.xls and grainsize.xls are tab-separated simulation outputs without process metadata; they do not identify an experimental dataset or establish which saved calibration produced them.</w:t>
+        <w:t xml:space="preserve">The --model option selects a parameter set; the --preset final-report option also supplies the 400 × 400 cell geometry and 58 μm nominal initial grain diameter used for the main comparisons. Explicit command-line options override preset values. Every run records its resolved settings, seed and executable fingerprint in run.properties.</w:t>
       </w:r>
     </w:p>
     <w:p>
@@ -1334,7 +1334,7 @@
         <w:pStyle w:val="Heading2"/>
       </w:pPr>
       <w:r>
-        <w:t>What the historical report establishes</w:t>
+        <w:t xml:space="preserve">Calibration and evidence</w:t>
       </w:r>
     </w:p>
     <w:p>
@@ -1342,7 +1342,7 @@
         <w:rPr>
           <w:b w:val="0"/>
         </w:rPr>
-        <w:t>The final student PDF adds Arrhenius parameter plots, six labelled experimental/simulation image pairs and neural-network output screenshots to the earlier DOCX. It gives Qp = 493039 J mol⁻¹, n = 3.91342 and α = 0.005439 with an incorrect Pa⁻¹ unit. The active peak-stress expression still uses n = 3.86. These fitted constants, their units and their associated code version require reconciliation.</w:t>
+        <w:t xml:space="preserve">FINAL_CA uses Qp = 493039 J mol⁻¹, stress exponent 3.86, intercept ln A = 40.26 and constitutive coefficient αs = 0.005439 MPa⁻¹. These values define the implemented candidate, not an independently validated fit. Exponent and intercept must be assessed together against measured flow curves before either is replaced. Taylor αT = 0.5 is a separate dimensionless coefficient.</w:t>
       </w:r>
     </w:p>
     <w:p>
@@ -1350,7 +1350,7 @@
         <w:rPr>
           <w:b w:val="0"/>
         </w:rPr>
-        <w:t>The original tables and screenshots are historical evidence of project activity. They are not used here to calculate experimental error. The raw flow curves, original EBSD/IPF files, specimen strains, segmentation rules, and auditable neural-network training code are absent. Numerical verification and experimental validation are therefore reported separately.</w:t>
+        <w:t xml:space="preserve">The repository includes source code, tests, recorded simulation runs and numerical diagnostics. It does not contain an experimental validation dataset. Raw flow curves, EBSD/IPF measurements, specimen strains and segmentation rules are needed to calculate material prediction errors. Numerical verification and experimental validation are therefore reported separately.</w:t>
       </w:r>
     </w:p>
     <w:p>
@@ -3131,7 +3131,7 @@
         <w:rPr>
           <w:b w:val="0"/>
         </w:rPr>
-        <w:t>The grain diameter d is area-equivalent and changes with its live lattice area. The mean density ρ̄ is weighted by cell area over the whole domain. The Taylor coefficient αT = 0.5 is dimensionless; it is distinct from αs in the empirical stress law. Constants are b = 2.5 × 10⁻¹⁰ m, R = 8.314 J mol⁻¹ K⁻¹ and kB = 1.38064852 × 10⁻²³ J K⁻¹. Initial densities retain the prototypes’ range of 10⁶ to 10⁷ m⁻² and require material calibration. A newborn grain starts at 1 m⁻², rather than a zero or artificial yield-density floor.</w:t>
+        <w:t xml:space="preserve">The grain diameter d is area-equivalent and changes with its live lattice area. The mean density ρ̄ is weighted by cell area over the whole domain. Taylor αT = 0.5 is dimensionless and distinct from αs in the empirical stress law. Constants are b = 2.5 × 10⁻¹⁰ m, R = 8.314 J mol⁻¹ K⁻¹ and kB = 1.38064852 × 10⁻²³ J K⁻¹. Initial densities are sampled from 10⁶ to 10⁷ m⁻² and require material calibration. A newborn grain starts at 1 m⁻², which is a numerical assumption rather than a measured nucleus density.</w:t>
       </w:r>
     </w:p>
     <w:p>
@@ -3152,7 +3152,7 @@
         <w:rPr>
           <w:b w:val="0"/>
         </w:rPr>
-        <w:t>FINAL_CA is the primary candidate for the new six-condition comparison because its active formulas most closely correspond to the final student PDF. It is retained as a candidate calibration. Constants below state the implemented values; their empirical uncertainties have not been established.</w:t>
+        <w:t xml:space="preserve">FINAL_CA is the selected candidate for the six-condition process comparison. It provides a critical-density factor of 0.95 and a temperature-only nucleation exponent. The constants below describe the implemented equations; their empirical uncertainties have not been established.</w:t>
       </w:r>
     </w:p>
     <w:p>
@@ -3766,7 +3766,7 @@
         <w:rPr>
           <w:b w:val="0"/>
         </w:rPr>
-        <w:t>For a recrystallized grain, the hardening coefficient in Eq. 1 is multiplied by fss, capped at 1. The saturation density in Eq. 7 is a source-derived reference scale, with no imposed density ceiling. The added finite-grain term 1/(bd) means it is not the exact equilibrium of the complete Eq. 1. Likewise, σp is a fitted stress scale, not a guarantee of the simulated peak. Logarithms of Z and strain rate retain the source numerical convention, with rate expressed in s⁻¹.</w:t>
+        <w:t xml:space="preserve">For a recrystallized grain, the hardening coefficient in Eq. 1 is multiplied by fss, capped at 1. The saturation density in Eq. 7 is a hardening/recovery reference scale, with no imposed ceiling. The finite-grain term 1/(bd) means it is not the exact equilibrium of the complete Eq. 1. Likewise, σp is a fitted stress scale, not a guarantee of the simulated peak. Logarithms of Z and strain rate use the numerical convention with rate expressed in s⁻¹.</w:t>
       </w:r>
     </w:p>
     <w:p>
@@ -3842,7 +3842,7 @@
         <w:rPr>
           <w:b w:val="0"/>
         </w:rPr>
-        <w:t>Equation 9 preserves the legacy modulus calibration and its 1453 °C reference. This number is unresolved: the alloy manufacturer gives a melting range of 1332 to 1380 °C [1]. The 1453 value must be traced to its original modulus fit or replaced through calibration, rather than silently interpreted as a verified alloy 617 melting temperature.</w:t>
+        <w:t xml:space="preserve">Equation 9 uses an empirical modulus relation with a 1453 °C reference coefficient. That coefficient is not a verified alloy 617 melting temperature: the manufacturer gives a melting range of 1332 to 1380 °C [1]. The modulus relation requires independent assessment before its coefficients are replaced.</w:t>
       </w:r>
     </w:p>
     <w:p>
@@ -4156,7 +4156,7 @@
         <w:rPr>
           <w:b w:val="0"/>
         </w:rPr>
-        <w:t>The effective coefficient Deff is named to avoid assuming that the archived Db is a standalone diffusivity. For Eq. 12 to yield mobility in m⁴ J⁻¹ s⁻¹, Deff must have units m³ s⁻¹, consistent with a diffusivity times boundary width. The source labels it boundary self-diffusion and does not establish the prefactor dimensions or width inclusion. That provenance remains unresolved. The denominator is kBT, not the recovery coefficient K2T.</w:t>
+        <w:t xml:space="preserve">For Eq. 12 to yield mobility in m⁴ J⁻¹ s⁻¹, the effective coefficient Deff must have units m³ s⁻¹, consistent with a diffusivity multiplied by boundary width. The effective width and prefactor interpretation are not established, so mobility remains a calibration assumption. The denominator is kBT. Recovery coefficient K2 is a separate quantity used in the density equation.</w:t>
       </w:r>
     </w:p>
     <w:p>
@@ -6081,7 +6081,7 @@
         <w:rPr>
           <w:b w:val="0"/>
         </w:rPr>
-        <w:t>The final-report preset selects FINAL_CA, 400×400 cells at 1 μm spacing and a 58 μm requested initial diameter, retaining strain 1.38, seed 42, a 1 μm nucleus and a 2 μm band. Section 8 states the production-run configuration. Nucleus diameter and band width are inherited starting assumptions requiring calibration. Pixel-centre inclusion and clipping mean a nucleus patch’s measured area-equivalent diameter can differ from its nominal diameter.</w:t>
+        <w:t xml:space="preserve">The final-report preset selects FINAL_CA, 400×400 cells at 1 μm spacing and a 58 μm requested initial diameter, with strain 1.38, seed 42, a 1 μm nucleus and a 2 μm band. Section 8 states the production-run configuration. Nucleus diameter and band width are starting assumptions requiring calibration. Pixel-centre inclusion and clipping mean a nucleus patch’s measured area-equivalent diameter can differ from its nominal diameter.</w:t>
       </w:r>
     </w:p>
     <w:p>
@@ -7116,7 +7116,7 @@
         <w:rPr>
           <w:b w:val="0"/>
         </w:rPr>
-        <w:t>The 18-run matrix compares CAC2, MAIN9 and FINAL_CA at the six conditions labelled in the final student PDF. Every run uses a 400 × 400 μm square, 1 μm cell spacing, 58 μm nominal initial diameter, 1 μm nucleus diameter, 2 μm band, seed 42 and target strain 1.38. The achieved initial number-mean diameter is 56.865 μm over 61 grains. Maximum strain increment is 0.00138 and total incoming hazard is capped at 0.25. Samples are saved at strain spacing 0.05 plus the exact endpoint. Final time is 1380 s at 0.001 s⁻¹ and 13.8 s at 0.1 s⁻¹. Table 6 reports FINAL_CA; Appendix A records all three candidates.</w:t>
+        <w:t xml:space="preserve">The 18-run matrix compares CAC2, MAIN9 and FINAL_CA at six temperature/rate conditions. Every run uses a 400 × 400 μm square, 1 μm cell spacing, 58 μm nominal initial diameter, 1 μm nucleus diameter, 2 μm band, seed 42 and target strain 1.38. The achieved initial number-mean diameter is 56.865 μm over 61 grains. Maximum strain increment is 0.00138 and total incoming hazard is capped at 0.25. Samples are saved at strain spacing 0.05 plus the exact endpoint. Final time is 1380 s at 0.001 s⁻¹ and 13.8 s at 0.1 s⁻¹. Table 6 reports FINAL_CA; Appendix A records all three candidates.</w:t>
       </w:r>
     </w:p>
     <w:p>
@@ -8577,7 +8577,7 @@
         <w:rPr>
           <w:b w:val="0"/>
         </w:rPr>
-        <w:t>At a fixed strain, decreasing strain rate increases elapsed time and changes the empirical Z-dependent coefficients. A resulting change in DRX may reflect both these mechanisms. Temperature also affects G, peak stress, recovery, mobility and nucleation. Several simultaneous changes make it unsafe to attribute a trend to one coefficient without a controlled sensitivity study. The figures on the next page are labelled by model and run conditions and are not overlays of historical experimental curves.</w:t>
+        <w:t xml:space="preserve">At a fixed strain, decreasing strain rate increases elapsed time and changes the empirical Z-dependent coefficients. A change in DRX may reflect both mechanisms. Temperature also affects G, peak stress, recovery, mobility and nucleation. Several simultaneous changes make it unsafe to attribute a trend to one coefficient without a controlled sensitivity study. The figures on the next page show simulated responses labelled by model and process condition.</w:t>
       </w:r>
     </w:p>
     <w:p>
@@ -8721,7 +8721,7 @@
         <w:rPr>
           <w:b w:val="0"/>
         </w:rPr>
-        <w:t>Figure 2  Simulated flow curves for three constitutive candidates under identical geometry, nominal microstructure and seed. The inherited laws produce different responses even after numerical corrections.</w:t>
+        <w:t xml:space="preserve">Figure 2  Simulated flow curves for three constitutive candidates under identical geometry, nominal microstructure and seed. Different empirical laws produce different responses within the same numerical engine.</w:t>
       </w:r>
     </w:p>
     <w:p>
@@ -9425,7 +9425,7 @@
         <w:pStyle w:val="Heading2"/>
       </w:pPr>
       <w:r>
-        <w:t>Historical comparison images</w:t>
+        <w:t xml:space="preserve">Microstructure comparisons</w:t>
       </w:r>
     </w:p>
     <w:p>
@@ -9433,7 +9433,7 @@
         <w:rPr>
           <w:b w:val="0"/>
         </w:rPr>
-        <w:t>The final PDF’s Table 5.1 labels experimental and simulation images at 1050 °C/0.001 s⁻¹, 1050 °C/0.1 s⁻¹, 1200 °C/0.001 s⁻¹, 1200 °C/0.1 s⁻¹, 1100 °C/0.1 s⁻¹ and 950 °C/0.001 s⁻¹. The embedded simulation image is identical in the 1200 °C/0.1 s⁻¹ and 950 °C/0.001 s⁻¹ rows. These images are not reproduced here as independent validation. Their provenance and condition mapping must be corrected from the original run outputs.</w:t>
+        <w:t xml:space="preserve">Microstructure validation requires measured grain-size distributions, recrystallized area fractions and boundary statistics at matched temperature, rate and specimen strain. Comparisons must use compatible physical field sizes and segmentation definitions. The simulation figures in this report show numerical outputs; no experimental microstructure comparison or prediction error is established.</w:t>
       </w:r>
     </w:p>
     <w:p>
@@ -9457,7 +9457,7 @@
         <w:rPr>
           <w:b w:val="0"/>
         </w:rPr>
-        <w:t>Fitting mobility or recovery to a flow curve is calibration. Assessing the same fitted curve is a fit-quality check. Validation should reserve independent temperatures, strain rates or specimens and then compare predictions without retuning. The final report’s single stress overlay and visual microstructure pairs do not provide that separation or uncertainty estimates.</w:t>
+        <w:t xml:space="preserve">Fitting mobility or recovery to a flow curve is calibration. Assessing the same fitted curve is a fit-quality check. Validation should reserve independent temperatures, strain rates or specimens and then compare predictions without retuning. Visual resemblance alone does not establish quantitative agreement, and numerical uncertainty must be considered alongside measurement uncertainty.</w:t>
       </w:r>
     </w:p>
     <w:p>
@@ -9473,7 +9473,7 @@
         <w:pStyle w:val="Heading2"/>
       </w:pPr>
       <w:r>
-        <w:t>ANN and PINN claims</w:t>
+        <w:t xml:space="preserve">Surrogate modelling extensions</w:t>
       </w:r>
     </w:p>
     <w:p>
@@ -9481,7 +9481,7 @@
         <w:rPr>
           <w:b w:val="0"/>
         </w:rPr>
-        <w:t>The final report describes a TensorFlow neural network trained largely on generated CA data and shows predicted DRX grain size and fraction. It does not provide the Python source, train/test split, layers, activations, optimisation settings or numerical test errors. Nor does it provide a physics-residual loss, derivative construction, collocation points, boundary/initial conditions or loss weights that would establish physics-informed training. The PINN designation and stress/strain prediction claims therefore remain unverified.</w:t>
+        <w:t xml:space="preserve">No ANN or PINN implementation or neural-network training dataset is included in this repository. An extension would need to document its training and validation split, network architecture, activations, optimization settings and held-out numerical errors. Physics-informed training additionally requires governing residuals, derivative construction, collocation points, boundary/initial conditions and loss weights. These would be new research components rather than capabilities demonstrated by the current simulator.</w:t>
       </w:r>
     </w:p>
     <w:p>
@@ -9510,7 +9510,7 @@
         <w:rPr>
           <w:b w:val="0"/>
         </w:rPr>
-        <w:t>The project now has a corrected, reproducible cellular automaton engine and separately named constitutive candidates. Consistent SI units, simultaneous Poisson capture, finite physical nuclei, a fixed physical nucleation band, positive density integration and exact output endpoints remove major numerical ambiguities in the archived prototypes. The FINAL_CA candidate preserves the active calibration most closely associated with the final student PDF while recording its intentional rate and state corrections.</w:t>
+        <w:t xml:space="preserve">The project provides a reproducible cellular automaton engine with separately selectable constitutive candidates. Consistent SI units, simultaneous Poisson capture, finite physical nuclei, a fixed physical nucleation band, positive density integration and exact output endpoints provide controlled numerical execution. FINAL_CA is the candidate used for the principal process comparison; CAC2 and MAIN9 show how different material laws affect the resulting stress and microstructure.</w:t>
       </w:r>
     </w:p>
     <w:p>
@@ -9526,7 +9526,7 @@
         <w:rPr>
           <w:b w:val="0"/>
         </w:rPr>
-        <w:t>The principal unresolved material assumptions are nucleus diameter, reactive-band width, initial density, modulus calibration, effective mobility coefficient dimensions and empirical activation/stress parameters. The 3.91342 versus 3.86 stress exponent conflict must be resolved through the original fitting data. The existing model should be described as a verified computational candidate whose material calibration remains to be validated.</w:t>
+        <w:t xml:space="preserve">The unresolved material assumptions include nucleus diameter, reactive-band width, initial density, modulus calibration, effective mobility dimensions and empirical activation/stress parameters. Stress exponent and intercept require a consistent fit against measured curves. The model is a numerically verified computational candidate whose material calibration remains to be validated.</w:t>
       </w:r>
     </w:p>
     <w:p>
@@ -9542,7 +9542,7 @@
         <w:rPr>
           <w:b w:val="0"/>
         </w:rPr>
-        <w:t>First, reconstruct an auditable experimental dataset and reconcile every figure with its condition, specimen strain and source. Second, fit the flow and microstructure outputs jointly, reserve validation conditions and report errors with experimental uncertainty and random-seed intervals. Third, refine h and the integration controls while holding physical dimensions fixed and using consistent initial microstructures. Fourth, examine whether omitted continuous recrystallization, twinning or solute-drag physics is required by the residual discrepancies.</w:t>
+        <w:t xml:space="preserve">First, assemble an auditable experimental dataset with condition, specimen strain and measurement definitions. Second, fit flow and microstructure outputs jointly, reserve validation conditions and report errors with measurement uncertainty and random-seed intervals. Third, refine h and the integration controls while holding physical dimensions fixed and using consistent initial microstructures. Fourth, assess whether omitted continuous recrystallization, twinning or solute-drag physics is required by the remaining discrepancies.</w:t>
       </w:r>
     </w:p>
     <w:p>
@@ -9566,7 +9566,7 @@
         <w:rPr>
           <w:b w:val="0"/>
         </w:rPr>
-        <w:t>The 24 completed production runs comprise 18 matched-condition runs and 6 selected diagnostic runs including their baseline. The sources, tests and batch workflow are under corrected/. The regular test compile uses Java 17 compatibility; the frozen production batch uses the available Java 21 compiler and runtime recorded in its manifest. Run records include results.csv, run.properties and summary.txt. The complete numeric comparison and diagnostics are in analysis/comparison_metrics.csv and analysis/summary.json. Analysis source SHA-256: 219dc596d88136b03574f0dcd49976812deb0c82019c03a57c099302bf240217. Engine bytecode SHA-256 (aggregate of 8 executable classes): b8ab94c497bd8dcadb1f66af85f2e4d33511350a984b443c6778ac46f45514f0.</w:t>
+        <w:t xml:space="preserve">The 24 completed production runs comprise 18 matched-condition runs and 6 selected diagnostic runs including their baseline. The repository root contains src/, test.sh, run.sh and analysis/. Regular compilation targets Java 17; the frozen production batch uses the Java 21 compiler and runtime recorded in its manifest. Run records include results.csv, run.properties and summary.txt. Numeric comparisons are in analysis/comparison_metrics.csv and analysis/summary.json. Source SHA-256: 219dc596d88136b03574f0dcd49976812deb0c82019c03a57c099302bf240217. Engine bytecode SHA-256, aggregated over 8 executable classes: b8ab94c497bd8dcadb1f66af85f2e4d33511350a984b443c6778ac46f45514f0.</w:t>
       </w:r>
     </w:p>
     <w:p>
@@ -9574,7 +9574,7 @@
         <w:rPr>
           <w:b w:val="0"/>
         </w:rPr>
-        <w:t>Original project files and reports are preserved. The source record for this revision includes the May 2024 DOCX, files654/PROJECT REPORT (FINAL).pdf, the archived Java candidates and corrected/VERIFICATION.md. The report’s simulation tables should be regenerated after any source, coefficient or numerical-control change.</w:t>
+        <w:t xml:space="preserve">README.md gives repository-relative commands and describes the model options. MODEL_NOTES.md records equations, units and calibration assumptions; VERIFICATION.md describes completed checks. The frozen reference build and recorded outputs support executable and data-integrity checks. Simulation tables should be regenerated after any source, coefficient or numerical-control change.</w:t>
       </w:r>
     </w:p>
     <w:p>

</xml_diff>